<commit_message>
hotfix: updated UC spec for AddUpdateProduct
</commit_message>
<xml_diff>
--- a/RequirementAnalysis/UCSpec/word/AddUpdateProduct.docx
+++ b/RequirementAnalysis/UCSpec/word/AddUpdateProduct.docx
@@ -171,7 +171,12 @@
               <w:rPr>
                 <w:rtl w:val="0"/>
               </w:rPr>
-              <w:t xml:space="preserve">This use case describes how a Product Manager adds a new product or updates an existing product in AIMS. The system enforces product-type requirements (Book/Newspaper/CD/DVD), validates the price band (current price must be 30%–150% of the original value), and stores a history of product additions and edits. If an input is invalid, the system notifies the Product Manager.</w:t>
+              <w:t xml:space="preserve">This use case describes the interaction between the Product Manager and the AIMS system when the Product Manager wishes to add a new product or update an existing product.</w:t>
+            </w:r>
+            <w:r>
+              <w:rPr>
+                <w:rtl w:val="0"/>
+              </w:rPr>
             </w:r>
           </w:p>
           <w:p>
@@ -318,13 +323,20 @@
               </w:numPr>
               <w:spacing w:after="0" w:afterAutospacing="0" w:before="240" w:lineRule="auto"/>
               <w:ind w:left="720" w:hanging="360"/>
-              <w:rPr/>
+              <w:rPr>
+                <w:rFonts w:ascii="Times New Roman" w:cs="Times New Roman" w:eastAsia="Times New Roman" w:hAnsi="Times New Roman"/>
+                <w:sz w:val="24"/>
+                <w:szCs w:val="24"/>
+              </w:rPr>
             </w:pPr>
             <w:r>
               <w:rPr>
+                <w:rFonts w:ascii="Times New Roman" w:cs="Times New Roman" w:eastAsia="Times New Roman" w:hAnsi="Times New Roman"/>
+                <w:sz w:val="24"/>
+                <w:szCs w:val="24"/>
                 <w:rtl w:val="0"/>
               </w:rPr>
-              <w:t xml:space="preserve">Product Manager requests to Add a new product or Update an existing product.</w:t>
+              <w:t xml:space="preserve">Product Manager requests to Add a new product</w:t>
               <w:br w:type="textWrapping"/>
             </w:r>
           </w:p>
@@ -336,10 +348,17 @@
               </w:numPr>
               <w:spacing w:after="0" w:afterAutospacing="0" w:before="0" w:beforeAutospacing="0" w:lineRule="auto"/>
               <w:ind w:left="720" w:hanging="360"/>
-              <w:rPr/>
+              <w:rPr>
+                <w:rFonts w:ascii="Times New Roman" w:cs="Times New Roman" w:eastAsia="Times New Roman" w:hAnsi="Times New Roman"/>
+                <w:sz w:val="24"/>
+                <w:szCs w:val="24"/>
+              </w:rPr>
             </w:pPr>
             <w:r>
               <w:rPr>
+                <w:rFonts w:ascii="Times New Roman" w:cs="Times New Roman" w:eastAsia="Times New Roman" w:hAnsi="Times New Roman"/>
+                <w:sz w:val="24"/>
+                <w:szCs w:val="24"/>
                 <w:rtl w:val="0"/>
               </w:rPr>
               <w:t xml:space="preserve">Software displays the product form with a product type selector (Book, Newspaper, CD, DVD).</w:t>
@@ -354,10 +373,17 @@
               </w:numPr>
               <w:spacing w:after="0" w:afterAutospacing="0" w:before="0" w:beforeAutospacing="0" w:lineRule="auto"/>
               <w:ind w:left="720" w:hanging="360"/>
-              <w:rPr/>
+              <w:rPr>
+                <w:rFonts w:ascii="Times New Roman" w:cs="Times New Roman" w:eastAsia="Times New Roman" w:hAnsi="Times New Roman"/>
+                <w:sz w:val="24"/>
+                <w:szCs w:val="24"/>
+              </w:rPr>
             </w:pPr>
             <w:r>
               <w:rPr>
+                <w:rFonts w:ascii="Times New Roman" w:cs="Times New Roman" w:eastAsia="Times New Roman" w:hAnsi="Times New Roman"/>
+                <w:sz w:val="24"/>
+                <w:szCs w:val="24"/>
                 <w:rtl w:val="0"/>
               </w:rPr>
               <w:t xml:space="preserve">Product Manager enters product data, including title/category (AIMS supports search by product title or category), original value, current price, and type-specific fields as required.</w:t>
@@ -372,10 +398,17 @@
               </w:numPr>
               <w:spacing w:after="0" w:afterAutospacing="0" w:before="0" w:beforeAutospacing="0" w:lineRule="auto"/>
               <w:ind w:left="720" w:hanging="360"/>
-              <w:rPr/>
+              <w:rPr>
+                <w:rFonts w:ascii="Times New Roman" w:cs="Times New Roman" w:eastAsia="Times New Roman" w:hAnsi="Times New Roman"/>
+                <w:sz w:val="24"/>
+                <w:szCs w:val="24"/>
+              </w:rPr>
             </w:pPr>
             <w:r>
               <w:rPr>
+                <w:rFonts w:ascii="Times New Roman" w:cs="Times New Roman" w:eastAsia="Times New Roman" w:hAnsi="Times New Roman"/>
+                <w:sz w:val="24"/>
+                <w:szCs w:val="24"/>
                 <w:rtl w:val="0"/>
               </w:rPr>
               <w:t xml:space="preserve">Software validates:</w:t>
@@ -390,10 +423,17 @@
               </w:numPr>
               <w:spacing w:after="0" w:afterAutospacing="0" w:before="0" w:beforeAutospacing="0" w:lineRule="auto"/>
               <w:ind w:left="1440" w:hanging="360"/>
-              <w:rPr/>
+              <w:rPr>
+                <w:rFonts w:ascii="Times New Roman" w:cs="Times New Roman" w:eastAsia="Times New Roman" w:hAnsi="Times New Roman"/>
+                <w:sz w:val="24"/>
+                <w:szCs w:val="24"/>
+              </w:rPr>
             </w:pPr>
             <w:r>
               <w:rPr>
+                <w:rFonts w:ascii="Times New Roman" w:cs="Times New Roman" w:eastAsia="Times New Roman" w:hAnsi="Times New Roman"/>
+                <w:sz w:val="24"/>
+                <w:szCs w:val="24"/>
                 <w:rtl w:val="0"/>
               </w:rPr>
               <w:t xml:space="preserve">Price policy: current price is within 30%–150% of the original value.</w:t>
@@ -408,10 +448,17 @@
               </w:numPr>
               <w:spacing w:after="0" w:afterAutospacing="0" w:before="0" w:beforeAutospacing="0" w:lineRule="auto"/>
               <w:ind w:left="1440" w:hanging="360"/>
-              <w:rPr/>
+              <w:rPr>
+                <w:rFonts w:ascii="Times New Roman" w:cs="Times New Roman" w:eastAsia="Times New Roman" w:hAnsi="Times New Roman"/>
+                <w:sz w:val="24"/>
+                <w:szCs w:val="24"/>
+              </w:rPr>
             </w:pPr>
             <w:r>
               <w:rPr>
+                <w:rFonts w:ascii="Times New Roman" w:cs="Times New Roman" w:eastAsia="Times New Roman" w:hAnsi="Times New Roman"/>
+                <w:sz w:val="24"/>
+                <w:szCs w:val="24"/>
                 <w:rtl w:val="0"/>
               </w:rPr>
               <w:t xml:space="preserve">Type-specific required fields are present (per product type list below).</w:t>
@@ -426,10 +473,17 @@
               </w:numPr>
               <w:spacing w:after="0" w:afterAutospacing="0" w:before="0" w:beforeAutospacing="0" w:lineRule="auto"/>
               <w:ind w:left="1440" w:hanging="360"/>
-              <w:rPr/>
+              <w:rPr>
+                <w:rFonts w:ascii="Times New Roman" w:cs="Times New Roman" w:eastAsia="Times New Roman" w:hAnsi="Times New Roman"/>
+                <w:sz w:val="24"/>
+                <w:szCs w:val="24"/>
+              </w:rPr>
             </w:pPr>
             <w:r>
               <w:rPr>
+                <w:rFonts w:ascii="Times New Roman" w:cs="Times New Roman" w:eastAsia="Times New Roman" w:hAnsi="Times New Roman"/>
+                <w:sz w:val="24"/>
+                <w:szCs w:val="24"/>
                 <w:rtl w:val="0"/>
               </w:rPr>
               <w:t xml:space="preserve">Date formats are valid where applicable (e.g., publication date). If invalid, the system notifies the Product Manager.</w:t>
@@ -444,49 +498,20 @@
               </w:numPr>
               <w:spacing w:after="0" w:afterAutospacing="0" w:before="0" w:beforeAutospacing="0" w:lineRule="auto"/>
               <w:ind w:left="720" w:hanging="360"/>
-              <w:rPr/>
+              <w:rPr>
+                <w:rFonts w:ascii="Times New Roman" w:cs="Times New Roman" w:eastAsia="Times New Roman" w:hAnsi="Times New Roman"/>
+                <w:sz w:val="24"/>
+                <w:szCs w:val="24"/>
+              </w:rPr>
             </w:pPr>
             <w:r>
               <w:rPr>
+                <w:rFonts w:ascii="Times New Roman" w:cs="Times New Roman" w:eastAsia="Times New Roman" w:hAnsi="Times New Roman"/>
+                <w:sz w:val="24"/>
+                <w:szCs w:val="24"/>
                 <w:rtl w:val="0"/>
               </w:rPr>
-              <w:t xml:space="preserve">Software performs the requested action:</w:t>
-              <w:br w:type="textWrapping"/>
-            </w:r>
-          </w:p>
-          <w:p>
-            <w:pPr>
-              <w:numPr>
-                <w:ilvl w:val="1"/>
-                <w:numId w:val="2"/>
-              </w:numPr>
-              <w:spacing w:after="0" w:afterAutospacing="0" w:before="0" w:beforeAutospacing="0" w:lineRule="auto"/>
-              <w:ind w:left="1440" w:hanging="360"/>
-              <w:rPr/>
-            </w:pPr>
-            <w:r>
-              <w:rPr>
-                <w:rtl w:val="0"/>
-              </w:rPr>
-              <w:t xml:space="preserve">Add: creates a new product record.</w:t>
-              <w:br w:type="textWrapping"/>
-            </w:r>
-          </w:p>
-          <w:p>
-            <w:pPr>
-              <w:numPr>
-                <w:ilvl w:val="1"/>
-                <w:numId w:val="2"/>
-              </w:numPr>
-              <w:spacing w:after="0" w:afterAutospacing="0" w:before="0" w:beforeAutospacing="0" w:lineRule="auto"/>
-              <w:ind w:left="1440" w:hanging="360"/>
-              <w:rPr/>
-            </w:pPr>
-            <w:r>
-              <w:rPr>
-                <w:rtl w:val="0"/>
-              </w:rPr>
-              <w:t xml:space="preserve">Update: applies the submitted changes to the existing record.</w:t>
+              <w:t xml:space="preserve">Software performs operation Add by creating a new product record.</w:t>
               <w:br w:type="textWrapping"/>
             </w:r>
           </w:p>
@@ -498,10 +523,17 @@
               </w:numPr>
               <w:spacing w:after="0" w:afterAutospacing="0" w:before="0" w:beforeAutospacing="0" w:lineRule="auto"/>
               <w:ind w:left="720" w:hanging="360"/>
-              <w:rPr/>
+              <w:rPr>
+                <w:rFonts w:ascii="Times New Roman" w:cs="Times New Roman" w:eastAsia="Times New Roman" w:hAnsi="Times New Roman"/>
+                <w:sz w:val="24"/>
+                <w:szCs w:val="24"/>
+              </w:rPr>
             </w:pPr>
             <w:r>
               <w:rPr>
+                <w:rFonts w:ascii="Times New Roman" w:cs="Times New Roman" w:eastAsia="Times New Roman" w:hAnsi="Times New Roman"/>
+                <w:sz w:val="24"/>
+                <w:szCs w:val="24"/>
                 <w:rtl w:val="0"/>
               </w:rPr>
               <w:t xml:space="preserve">Software stores a history entry for the addition or edit.</w:t>
@@ -516,20 +548,25 @@
               </w:numPr>
               <w:spacing w:after="240" w:before="0" w:beforeAutospacing="0" w:lineRule="auto"/>
               <w:ind w:left="720" w:hanging="360"/>
-              <w:rPr/>
+              <w:rPr>
+                <w:rFonts w:ascii="Times New Roman" w:cs="Times New Roman" w:eastAsia="Times New Roman" w:hAnsi="Times New Roman"/>
+                <w:sz w:val="24"/>
+                <w:szCs w:val="24"/>
+              </w:rPr>
             </w:pPr>
             <w:r>
               <w:rPr>
+                <w:rFonts w:ascii="Times New Roman" w:cs="Times New Roman" w:eastAsia="Times New Roman" w:hAnsi="Times New Roman"/>
+                <w:sz w:val="24"/>
+                <w:szCs w:val="24"/>
                 <w:rtl w:val="0"/>
               </w:rPr>
               <w:t xml:space="preserve">Software confirms success and shows the saved product summary.</w:t>
             </w:r>
             <w:r>
               <w:rPr>
-                <w:i w:val="1"/>
                 <w:rtl w:val="0"/>
               </w:rPr>
-              <w:br w:type="textWrapping"/>
             </w:r>
           </w:p>
           <w:p>
@@ -812,10 +849,17 @@
                 </w:tcPr>
                 <w:p>
                   <w:pPr>
-                    <w:rPr/>
-                  </w:pPr>
-                  <w:r>
-                    <w:rPr>
+                    <w:rPr>
+                      <w:rFonts w:ascii="Times New Roman" w:cs="Times New Roman" w:eastAsia="Times New Roman" w:hAnsi="Times New Roman"/>
+                      <w:sz w:val="24"/>
+                      <w:szCs w:val="24"/>
+                    </w:rPr>
+                  </w:pPr>
+                  <w:r>
+                    <w:rPr>
+                      <w:rFonts w:ascii="Times New Roman" w:cs="Times New Roman" w:eastAsia="Times New Roman" w:hAnsi="Times New Roman"/>
+                      <w:sz w:val="24"/>
+                      <w:szCs w:val="24"/>
                       <w:rtl w:val="0"/>
                     </w:rPr>
                     <w:t xml:space="preserve">1</w:t>
@@ -840,94 +884,122 @@
                 </w:tcPr>
                 <w:p>
                   <w:pPr>
-                    <w:rPr/>
-                  </w:pPr>
-                  <w:r>
-                    <w:rPr>
-                      <w:rtl w:val="0"/>
-                    </w:rPr>
-                    <w:t xml:space="preserve">At Step 4</w:t>
-                  </w:r>
-                </w:p>
-              </w:tc>
-              <w:tc>
-                <w:tcPr>
-                  <w:tcBorders>
-                    <w:top w:color="000000" w:space="0" w:sz="8" w:val="single"/>
-                    <w:left w:color="000000" w:space="0" w:sz="8" w:val="single"/>
-                    <w:bottom w:color="000000" w:space="0" w:sz="8" w:val="single"/>
-                    <w:right w:color="000000" w:space="0" w:sz="8" w:val="single"/>
-                  </w:tcBorders>
-                  <w:tcMar>
-                    <w:top w:w="100.0" w:type="dxa"/>
-                    <w:left w:w="100.0" w:type="dxa"/>
-                    <w:bottom w:w="100.0" w:type="dxa"/>
-                    <w:right w:w="100.0" w:type="dxa"/>
-                  </w:tcMar>
-                  <w:vAlign w:val="top"/>
-                </w:tcPr>
-                <w:p>
-                  <w:pPr>
-                    <w:rPr/>
-                  </w:pPr>
-                  <w:r>
-                    <w:rPr>
-                      <w:rtl w:val="0"/>
-                    </w:rPr>
-                    <w:t xml:space="preserve">Price violates the 30%–150% band</w:t>
-                  </w:r>
-                </w:p>
-              </w:tc>
-              <w:tc>
-                <w:tcPr>
-                  <w:tcBorders>
-                    <w:top w:color="000000" w:space="0" w:sz="8" w:val="single"/>
-                    <w:left w:color="000000" w:space="0" w:sz="8" w:val="single"/>
-                    <w:bottom w:color="000000" w:space="0" w:sz="8" w:val="single"/>
-                    <w:right w:color="000000" w:space="0" w:sz="8" w:val="single"/>
-                  </w:tcBorders>
-                  <w:tcMar>
-                    <w:top w:w="100.0" w:type="dxa"/>
-                    <w:left w:w="100.0" w:type="dxa"/>
-                    <w:bottom w:w="100.0" w:type="dxa"/>
-                    <w:right w:w="100.0" w:type="dxa"/>
-                  </w:tcMar>
-                  <w:vAlign w:val="top"/>
-                </w:tcPr>
-                <w:p>
-                  <w:pPr>
-                    <w:rPr/>
-                  </w:pPr>
-                  <w:r>
-                    <w:rPr>
-                      <w:rtl w:val="0"/>
-                    </w:rPr>
-                    <w:t xml:space="preserve">Software notifies invalid price; submission rejected</w:t>
-                  </w:r>
-                </w:p>
-              </w:tc>
-              <w:tc>
-                <w:tcPr>
-                  <w:tcBorders>
-                    <w:top w:color="000000" w:space="0" w:sz="8" w:val="single"/>
-                    <w:left w:color="000000" w:space="0" w:sz="8" w:val="single"/>
-                    <w:bottom w:color="000000" w:space="0" w:sz="8" w:val="single"/>
-                    <w:right w:color="000000" w:space="0" w:sz="8" w:val="single"/>
-                  </w:tcBorders>
-                  <w:tcMar>
-                    <w:top w:w="100.0" w:type="dxa"/>
-                    <w:left w:w="100.0" w:type="dxa"/>
-                    <w:bottom w:w="100.0" w:type="dxa"/>
-                    <w:right w:w="100.0" w:type="dxa"/>
-                  </w:tcMar>
-                  <w:vAlign w:val="top"/>
-                </w:tcPr>
-                <w:p>
-                  <w:pPr>
-                    <w:rPr/>
-                  </w:pPr>
-                  <w:r>
-                    <w:rPr>
+                    <w:rPr>
+                      <w:rFonts w:ascii="Times New Roman" w:cs="Times New Roman" w:eastAsia="Times New Roman" w:hAnsi="Times New Roman"/>
+                      <w:sz w:val="24"/>
+                      <w:szCs w:val="24"/>
+                    </w:rPr>
+                  </w:pPr>
+                  <w:r>
+                    <w:rPr>
+                      <w:rFonts w:ascii="Times New Roman" w:cs="Times New Roman" w:eastAsia="Times New Roman" w:hAnsi="Times New Roman"/>
+                      <w:sz w:val="24"/>
+                      <w:szCs w:val="24"/>
+                      <w:rtl w:val="0"/>
+                    </w:rPr>
+                    <w:t xml:space="preserve">At Step 1</w:t>
+                  </w:r>
+                </w:p>
+              </w:tc>
+              <w:tc>
+                <w:tcPr>
+                  <w:tcBorders>
+                    <w:top w:color="000000" w:space="0" w:sz="8" w:val="single"/>
+                    <w:left w:color="000000" w:space="0" w:sz="8" w:val="single"/>
+                    <w:bottom w:color="000000" w:space="0" w:sz="8" w:val="single"/>
+                    <w:right w:color="000000" w:space="0" w:sz="8" w:val="single"/>
+                  </w:tcBorders>
+                  <w:tcMar>
+                    <w:top w:w="100.0" w:type="dxa"/>
+                    <w:left w:w="100.0" w:type="dxa"/>
+                    <w:bottom w:w="100.0" w:type="dxa"/>
+                    <w:right w:w="100.0" w:type="dxa"/>
+                  </w:tcMar>
+                  <w:vAlign w:val="top"/>
+                </w:tcPr>
+                <w:p>
+                  <w:pPr>
+                    <w:rPr>
+                      <w:rFonts w:ascii="Times New Roman" w:cs="Times New Roman" w:eastAsia="Times New Roman" w:hAnsi="Times New Roman"/>
+                      <w:sz w:val="24"/>
+                      <w:szCs w:val="24"/>
+                    </w:rPr>
+                  </w:pPr>
+                  <w:r>
+                    <w:rPr>
+                      <w:rFonts w:ascii="Times New Roman" w:cs="Times New Roman" w:eastAsia="Times New Roman" w:hAnsi="Times New Roman"/>
+                      <w:sz w:val="24"/>
+                      <w:szCs w:val="24"/>
+                      <w:rtl w:val="0"/>
+                    </w:rPr>
+                    <w:t xml:space="preserve">User chooses Update operation</w:t>
+                  </w:r>
+                </w:p>
+              </w:tc>
+              <w:tc>
+                <w:tcPr>
+                  <w:tcBorders>
+                    <w:top w:color="000000" w:space="0" w:sz="8" w:val="single"/>
+                    <w:left w:color="000000" w:space="0" w:sz="8" w:val="single"/>
+                    <w:bottom w:color="000000" w:space="0" w:sz="8" w:val="single"/>
+                    <w:right w:color="000000" w:space="0" w:sz="8" w:val="single"/>
+                  </w:tcBorders>
+                  <w:tcMar>
+                    <w:top w:w="100.0" w:type="dxa"/>
+                    <w:left w:w="100.0" w:type="dxa"/>
+                    <w:bottom w:w="100.0" w:type="dxa"/>
+                    <w:right w:w="100.0" w:type="dxa"/>
+                  </w:tcMar>
+                  <w:vAlign w:val="top"/>
+                </w:tcPr>
+                <w:p>
+                  <w:pPr>
+                    <w:rPr>
+                      <w:rFonts w:ascii="Times New Roman" w:cs="Times New Roman" w:eastAsia="Times New Roman" w:hAnsi="Times New Roman"/>
+                      <w:sz w:val="24"/>
+                      <w:szCs w:val="24"/>
+                    </w:rPr>
+                  </w:pPr>
+                  <w:r>
+                    <w:rPr>
+                      <w:rFonts w:ascii="Times New Roman" w:cs="Times New Roman" w:eastAsia="Times New Roman" w:hAnsi="Times New Roman"/>
+                      <w:sz w:val="24"/>
+                      <w:szCs w:val="24"/>
+                      <w:rtl w:val="0"/>
+                    </w:rPr>
+                    <w:t xml:space="preserve">Software displays Update form</w:t>
+                  </w:r>
+                </w:p>
+              </w:tc>
+              <w:tc>
+                <w:tcPr>
+                  <w:tcBorders>
+                    <w:top w:color="000000" w:space="0" w:sz="8" w:val="single"/>
+                    <w:left w:color="000000" w:space="0" w:sz="8" w:val="single"/>
+                    <w:bottom w:color="000000" w:space="0" w:sz="8" w:val="single"/>
+                    <w:right w:color="000000" w:space="0" w:sz="8" w:val="single"/>
+                  </w:tcBorders>
+                  <w:tcMar>
+                    <w:top w:w="100.0" w:type="dxa"/>
+                    <w:left w:w="100.0" w:type="dxa"/>
+                    <w:bottom w:w="100.0" w:type="dxa"/>
+                    <w:right w:w="100.0" w:type="dxa"/>
+                  </w:tcMar>
+                  <w:vAlign w:val="top"/>
+                </w:tcPr>
+                <w:p>
+                  <w:pPr>
+                    <w:rPr>
+                      <w:rFonts w:ascii="Times New Roman" w:cs="Times New Roman" w:eastAsia="Times New Roman" w:hAnsi="Times New Roman"/>
+                      <w:sz w:val="24"/>
+                      <w:szCs w:val="24"/>
+                    </w:rPr>
+                  </w:pPr>
+                  <w:r>
+                    <w:rPr>
+                      <w:rFonts w:ascii="Times New Roman" w:cs="Times New Roman" w:eastAsia="Times New Roman" w:hAnsi="Times New Roman"/>
+                      <w:sz w:val="24"/>
+                      <w:szCs w:val="24"/>
                       <w:rtl w:val="0"/>
                     </w:rPr>
                     <w:t xml:space="preserve">Step 2</w:t>
@@ -959,10 +1031,17 @@
                 </w:tcPr>
                 <w:p>
                   <w:pPr>
-                    <w:rPr/>
-                  </w:pPr>
-                  <w:r>
-                    <w:rPr>
+                    <w:rPr>
+                      <w:rFonts w:ascii="Times New Roman" w:cs="Times New Roman" w:eastAsia="Times New Roman" w:hAnsi="Times New Roman"/>
+                      <w:sz w:val="24"/>
+                      <w:szCs w:val="24"/>
+                    </w:rPr>
+                  </w:pPr>
+                  <w:r>
+                    <w:rPr>
+                      <w:rFonts w:ascii="Times New Roman" w:cs="Times New Roman" w:eastAsia="Times New Roman" w:hAnsi="Times New Roman"/>
+                      <w:sz w:val="24"/>
+                      <w:szCs w:val="24"/>
                       <w:rtl w:val="0"/>
                     </w:rPr>
                     <w:t xml:space="preserve">2</w:t>
@@ -987,10 +1066,17 @@
                 </w:tcPr>
                 <w:p>
                   <w:pPr>
-                    <w:rPr/>
-                  </w:pPr>
-                  <w:r>
-                    <w:rPr>
+                    <w:rPr>
+                      <w:rFonts w:ascii="Times New Roman" w:cs="Times New Roman" w:eastAsia="Times New Roman" w:hAnsi="Times New Roman"/>
+                      <w:sz w:val="24"/>
+                      <w:szCs w:val="24"/>
+                    </w:rPr>
+                  </w:pPr>
+                  <w:r>
+                    <w:rPr>
+                      <w:rFonts w:ascii="Times New Roman" w:cs="Times New Roman" w:eastAsia="Times New Roman" w:hAnsi="Times New Roman"/>
+                      <w:sz w:val="24"/>
+                      <w:szCs w:val="24"/>
                       <w:rtl w:val="0"/>
                     </w:rPr>
                     <w:t xml:space="preserve">At Step 4</w:t>
@@ -1015,66 +1101,87 @@
                 </w:tcPr>
                 <w:p>
                   <w:pPr>
-                    <w:rPr/>
-                  </w:pPr>
-                  <w:r>
-                    <w:rPr>
-                      <w:rtl w:val="0"/>
-                    </w:rPr>
-                    <w:t xml:space="preserve">Missing type-specific required info</w:t>
-                  </w:r>
-                </w:p>
-              </w:tc>
-              <w:tc>
-                <w:tcPr>
-                  <w:tcBorders>
-                    <w:top w:color="000000" w:space="0" w:sz="8" w:val="single"/>
-                    <w:left w:color="000000" w:space="0" w:sz="8" w:val="single"/>
-                    <w:bottom w:color="000000" w:space="0" w:sz="8" w:val="single"/>
-                    <w:right w:color="000000" w:space="0" w:sz="8" w:val="single"/>
-                  </w:tcBorders>
-                  <w:tcMar>
-                    <w:top w:w="100.0" w:type="dxa"/>
-                    <w:left w:w="100.0" w:type="dxa"/>
-                    <w:bottom w:w="100.0" w:type="dxa"/>
-                    <w:right w:w="100.0" w:type="dxa"/>
-                  </w:tcMar>
-                  <w:vAlign w:val="top"/>
-                </w:tcPr>
-                <w:p>
-                  <w:pPr>
-                    <w:rPr/>
-                  </w:pPr>
-                  <w:r>
-                    <w:rPr>
-                      <w:rtl w:val="0"/>
-                    </w:rPr>
-                    <w:t xml:space="preserve">Software notifies invalid/insufficient info</w:t>
-                  </w:r>
-                </w:p>
-              </w:tc>
-              <w:tc>
-                <w:tcPr>
-                  <w:tcBorders>
-                    <w:top w:color="000000" w:space="0" w:sz="8" w:val="single"/>
-                    <w:left w:color="000000" w:space="0" w:sz="8" w:val="single"/>
-                    <w:bottom w:color="000000" w:space="0" w:sz="8" w:val="single"/>
-                    <w:right w:color="000000" w:space="0" w:sz="8" w:val="single"/>
-                  </w:tcBorders>
-                  <w:tcMar>
-                    <w:top w:w="100.0" w:type="dxa"/>
-                    <w:left w:w="100.0" w:type="dxa"/>
-                    <w:bottom w:w="100.0" w:type="dxa"/>
-                    <w:right w:w="100.0" w:type="dxa"/>
-                  </w:tcMar>
-                  <w:vAlign w:val="top"/>
-                </w:tcPr>
-                <w:p>
-                  <w:pPr>
-                    <w:rPr/>
-                  </w:pPr>
-                  <w:r>
-                    <w:rPr>
+                    <w:rPr>
+                      <w:rFonts w:ascii="Times New Roman" w:cs="Times New Roman" w:eastAsia="Times New Roman" w:hAnsi="Times New Roman"/>
+                      <w:sz w:val="24"/>
+                      <w:szCs w:val="24"/>
+                    </w:rPr>
+                  </w:pPr>
+                  <w:r>
+                    <w:rPr>
+                      <w:rFonts w:ascii="Times New Roman" w:cs="Times New Roman" w:eastAsia="Times New Roman" w:hAnsi="Times New Roman"/>
+                      <w:sz w:val="24"/>
+                      <w:szCs w:val="24"/>
+                      <w:rtl w:val="0"/>
+                    </w:rPr>
+                    <w:t xml:space="preserve">Price violates the 30%–150% band</w:t>
+                  </w:r>
+                </w:p>
+              </w:tc>
+              <w:tc>
+                <w:tcPr>
+                  <w:tcBorders>
+                    <w:top w:color="000000" w:space="0" w:sz="8" w:val="single"/>
+                    <w:left w:color="000000" w:space="0" w:sz="8" w:val="single"/>
+                    <w:bottom w:color="000000" w:space="0" w:sz="8" w:val="single"/>
+                    <w:right w:color="000000" w:space="0" w:sz="8" w:val="single"/>
+                  </w:tcBorders>
+                  <w:tcMar>
+                    <w:top w:w="100.0" w:type="dxa"/>
+                    <w:left w:w="100.0" w:type="dxa"/>
+                    <w:bottom w:w="100.0" w:type="dxa"/>
+                    <w:right w:w="100.0" w:type="dxa"/>
+                  </w:tcMar>
+                  <w:vAlign w:val="top"/>
+                </w:tcPr>
+                <w:p>
+                  <w:pPr>
+                    <w:rPr>
+                      <w:rFonts w:ascii="Times New Roman" w:cs="Times New Roman" w:eastAsia="Times New Roman" w:hAnsi="Times New Roman"/>
+                      <w:sz w:val="24"/>
+                      <w:szCs w:val="24"/>
+                    </w:rPr>
+                  </w:pPr>
+                  <w:r>
+                    <w:rPr>
+                      <w:rFonts w:ascii="Times New Roman" w:cs="Times New Roman" w:eastAsia="Times New Roman" w:hAnsi="Times New Roman"/>
+                      <w:sz w:val="24"/>
+                      <w:szCs w:val="24"/>
+                      <w:rtl w:val="0"/>
+                    </w:rPr>
+                    <w:t xml:space="preserve">Software notifies invalid price; submission rejected</w:t>
+                  </w:r>
+                </w:p>
+              </w:tc>
+              <w:tc>
+                <w:tcPr>
+                  <w:tcBorders>
+                    <w:top w:color="000000" w:space="0" w:sz="8" w:val="single"/>
+                    <w:left w:color="000000" w:space="0" w:sz="8" w:val="single"/>
+                    <w:bottom w:color="000000" w:space="0" w:sz="8" w:val="single"/>
+                    <w:right w:color="000000" w:space="0" w:sz="8" w:val="single"/>
+                  </w:tcBorders>
+                  <w:tcMar>
+                    <w:top w:w="100.0" w:type="dxa"/>
+                    <w:left w:w="100.0" w:type="dxa"/>
+                    <w:bottom w:w="100.0" w:type="dxa"/>
+                    <w:right w:w="100.0" w:type="dxa"/>
+                  </w:tcMar>
+                  <w:vAlign w:val="top"/>
+                </w:tcPr>
+                <w:p>
+                  <w:pPr>
+                    <w:rPr>
+                      <w:rFonts w:ascii="Times New Roman" w:cs="Times New Roman" w:eastAsia="Times New Roman" w:hAnsi="Times New Roman"/>
+                      <w:sz w:val="24"/>
+                      <w:szCs w:val="24"/>
+                    </w:rPr>
+                  </w:pPr>
+                  <w:r>
+                    <w:rPr>
+                      <w:rFonts w:ascii="Times New Roman" w:cs="Times New Roman" w:eastAsia="Times New Roman" w:hAnsi="Times New Roman"/>
+                      <w:sz w:val="24"/>
+                      <w:szCs w:val="24"/>
                       <w:rtl w:val="0"/>
                     </w:rPr>
                     <w:t xml:space="preserve">Step 2</w:t>
@@ -1106,10 +1213,17 @@
                 </w:tcPr>
                 <w:p>
                   <w:pPr>
-                    <w:rPr/>
-                  </w:pPr>
-                  <w:r>
-                    <w:rPr>
+                    <w:rPr>
+                      <w:rFonts w:ascii="Times New Roman" w:cs="Times New Roman" w:eastAsia="Times New Roman" w:hAnsi="Times New Roman"/>
+                      <w:sz w:val="24"/>
+                      <w:szCs w:val="24"/>
+                    </w:rPr>
+                  </w:pPr>
+                  <w:r>
+                    <w:rPr>
+                      <w:rFonts w:ascii="Times New Roman" w:cs="Times New Roman" w:eastAsia="Times New Roman" w:hAnsi="Times New Roman"/>
+                      <w:sz w:val="24"/>
+                      <w:szCs w:val="24"/>
                       <w:rtl w:val="0"/>
                     </w:rPr>
                     <w:t xml:space="preserve">3</w:t>
@@ -1134,10 +1248,17 @@
                 </w:tcPr>
                 <w:p>
                   <w:pPr>
-                    <w:rPr/>
-                  </w:pPr>
-                  <w:r>
-                    <w:rPr>
+                    <w:rPr>
+                      <w:rFonts w:ascii="Times New Roman" w:cs="Times New Roman" w:eastAsia="Times New Roman" w:hAnsi="Times New Roman"/>
+                      <w:sz w:val="24"/>
+                      <w:szCs w:val="24"/>
+                    </w:rPr>
+                  </w:pPr>
+                  <w:r>
+                    <w:rPr>
+                      <w:rFonts w:ascii="Times New Roman" w:cs="Times New Roman" w:eastAsia="Times New Roman" w:hAnsi="Times New Roman"/>
+                      <w:sz w:val="24"/>
+                      <w:szCs w:val="24"/>
                       <w:rtl w:val="0"/>
                     </w:rPr>
                     <w:t xml:space="preserve">At Step 4</w:t>
@@ -1162,66 +1283,87 @@
                 </w:tcPr>
                 <w:p>
                   <w:pPr>
-                    <w:rPr/>
-                  </w:pPr>
-                  <w:r>
-                    <w:rPr>
-                      <w:rtl w:val="0"/>
-                    </w:rPr>
-                    <w:t xml:space="preserve">Invalid date format (e.g., publication date)</w:t>
-                  </w:r>
-                </w:p>
-              </w:tc>
-              <w:tc>
-                <w:tcPr>
-                  <w:tcBorders>
-                    <w:top w:color="000000" w:space="0" w:sz="8" w:val="single"/>
-                    <w:left w:color="000000" w:space="0" w:sz="8" w:val="single"/>
-                    <w:bottom w:color="000000" w:space="0" w:sz="8" w:val="single"/>
-                    <w:right w:color="000000" w:space="0" w:sz="8" w:val="single"/>
-                  </w:tcBorders>
-                  <w:tcMar>
-                    <w:top w:w="100.0" w:type="dxa"/>
-                    <w:left w:w="100.0" w:type="dxa"/>
-                    <w:bottom w:w="100.0" w:type="dxa"/>
-                    <w:right w:w="100.0" w:type="dxa"/>
-                  </w:tcMar>
-                  <w:vAlign w:val="top"/>
-                </w:tcPr>
-                <w:p>
-                  <w:pPr>
-                    <w:rPr/>
-                  </w:pPr>
-                  <w:r>
-                    <w:rPr>
-                      <w:rtl w:val="0"/>
-                    </w:rPr>
-                    <w:t xml:space="preserve">Software notifies invalid format</w:t>
-                  </w:r>
-                </w:p>
-              </w:tc>
-              <w:tc>
-                <w:tcPr>
-                  <w:tcBorders>
-                    <w:top w:color="000000" w:space="0" w:sz="8" w:val="single"/>
-                    <w:left w:color="000000" w:space="0" w:sz="8" w:val="single"/>
-                    <w:bottom w:color="000000" w:space="0" w:sz="8" w:val="single"/>
-                    <w:right w:color="000000" w:space="0" w:sz="8" w:val="single"/>
-                  </w:tcBorders>
-                  <w:tcMar>
-                    <w:top w:w="100.0" w:type="dxa"/>
-                    <w:left w:w="100.0" w:type="dxa"/>
-                    <w:bottom w:w="100.0" w:type="dxa"/>
-                    <w:right w:w="100.0" w:type="dxa"/>
-                  </w:tcMar>
-                  <w:vAlign w:val="top"/>
-                </w:tcPr>
-                <w:p>
-                  <w:pPr>
-                    <w:rPr/>
-                  </w:pPr>
-                  <w:r>
-                    <w:rPr>
+                    <w:rPr>
+                      <w:rFonts w:ascii="Times New Roman" w:cs="Times New Roman" w:eastAsia="Times New Roman" w:hAnsi="Times New Roman"/>
+                      <w:sz w:val="24"/>
+                      <w:szCs w:val="24"/>
+                    </w:rPr>
+                  </w:pPr>
+                  <w:r>
+                    <w:rPr>
+                      <w:rFonts w:ascii="Times New Roman" w:cs="Times New Roman" w:eastAsia="Times New Roman" w:hAnsi="Times New Roman"/>
+                      <w:sz w:val="24"/>
+                      <w:szCs w:val="24"/>
+                      <w:rtl w:val="0"/>
+                    </w:rPr>
+                    <w:t xml:space="preserve">Missing type-specific required info</w:t>
+                  </w:r>
+                </w:p>
+              </w:tc>
+              <w:tc>
+                <w:tcPr>
+                  <w:tcBorders>
+                    <w:top w:color="000000" w:space="0" w:sz="8" w:val="single"/>
+                    <w:left w:color="000000" w:space="0" w:sz="8" w:val="single"/>
+                    <w:bottom w:color="000000" w:space="0" w:sz="8" w:val="single"/>
+                    <w:right w:color="000000" w:space="0" w:sz="8" w:val="single"/>
+                  </w:tcBorders>
+                  <w:tcMar>
+                    <w:top w:w="100.0" w:type="dxa"/>
+                    <w:left w:w="100.0" w:type="dxa"/>
+                    <w:bottom w:w="100.0" w:type="dxa"/>
+                    <w:right w:w="100.0" w:type="dxa"/>
+                  </w:tcMar>
+                  <w:vAlign w:val="top"/>
+                </w:tcPr>
+                <w:p>
+                  <w:pPr>
+                    <w:rPr>
+                      <w:rFonts w:ascii="Times New Roman" w:cs="Times New Roman" w:eastAsia="Times New Roman" w:hAnsi="Times New Roman"/>
+                      <w:sz w:val="24"/>
+                      <w:szCs w:val="24"/>
+                    </w:rPr>
+                  </w:pPr>
+                  <w:r>
+                    <w:rPr>
+                      <w:rFonts w:ascii="Times New Roman" w:cs="Times New Roman" w:eastAsia="Times New Roman" w:hAnsi="Times New Roman"/>
+                      <w:sz w:val="24"/>
+                      <w:szCs w:val="24"/>
+                      <w:rtl w:val="0"/>
+                    </w:rPr>
+                    <w:t xml:space="preserve">Software notifies invalid/insufficient info</w:t>
+                  </w:r>
+                </w:p>
+              </w:tc>
+              <w:tc>
+                <w:tcPr>
+                  <w:tcBorders>
+                    <w:top w:color="000000" w:space="0" w:sz="8" w:val="single"/>
+                    <w:left w:color="000000" w:space="0" w:sz="8" w:val="single"/>
+                    <w:bottom w:color="000000" w:space="0" w:sz="8" w:val="single"/>
+                    <w:right w:color="000000" w:space="0" w:sz="8" w:val="single"/>
+                  </w:tcBorders>
+                  <w:tcMar>
+                    <w:top w:w="100.0" w:type="dxa"/>
+                    <w:left w:w="100.0" w:type="dxa"/>
+                    <w:bottom w:w="100.0" w:type="dxa"/>
+                    <w:right w:w="100.0" w:type="dxa"/>
+                  </w:tcMar>
+                  <w:vAlign w:val="top"/>
+                </w:tcPr>
+                <w:p>
+                  <w:pPr>
+                    <w:rPr>
+                      <w:rFonts w:ascii="Times New Roman" w:cs="Times New Roman" w:eastAsia="Times New Roman" w:hAnsi="Times New Roman"/>
+                      <w:sz w:val="24"/>
+                      <w:szCs w:val="24"/>
+                    </w:rPr>
+                  </w:pPr>
+                  <w:r>
+                    <w:rPr>
+                      <w:rFonts w:ascii="Times New Roman" w:cs="Times New Roman" w:eastAsia="Times New Roman" w:hAnsi="Times New Roman"/>
+                      <w:sz w:val="24"/>
+                      <w:szCs w:val="24"/>
                       <w:rtl w:val="0"/>
                     </w:rPr>
                     <w:t xml:space="preserve">Step 2</w:t>
@@ -1253,10 +1395,17 @@
                 </w:tcPr>
                 <w:p>
                   <w:pPr>
-                    <w:rPr/>
-                  </w:pPr>
-                  <w:r>
-                    <w:rPr>
+                    <w:rPr>
+                      <w:rFonts w:ascii="Times New Roman" w:cs="Times New Roman" w:eastAsia="Times New Roman" w:hAnsi="Times New Roman"/>
+                      <w:sz w:val="24"/>
+                      <w:szCs w:val="24"/>
+                    </w:rPr>
+                  </w:pPr>
+                  <w:r>
+                    <w:rPr>
+                      <w:rFonts w:ascii="Times New Roman" w:cs="Times New Roman" w:eastAsia="Times New Roman" w:hAnsi="Times New Roman"/>
+                      <w:sz w:val="24"/>
+                      <w:szCs w:val="24"/>
                       <w:rtl w:val="0"/>
                     </w:rPr>
                     <w:t xml:space="preserve">4</w:t>
@@ -1281,10 +1430,381 @@
                 </w:tcPr>
                 <w:p>
                   <w:pPr>
-                    <w:rPr/>
-                  </w:pPr>
-                  <w:r>
-                    <w:rPr>
+                    <w:rPr>
+                      <w:rFonts w:ascii="Times New Roman" w:cs="Times New Roman" w:eastAsia="Times New Roman" w:hAnsi="Times New Roman"/>
+                      <w:sz w:val="24"/>
+                      <w:szCs w:val="24"/>
+                    </w:rPr>
+                  </w:pPr>
+                  <w:r>
+                    <w:rPr>
+                      <w:rFonts w:ascii="Times New Roman" w:cs="Times New Roman" w:eastAsia="Times New Roman" w:hAnsi="Times New Roman"/>
+                      <w:sz w:val="24"/>
+                      <w:szCs w:val="24"/>
+                      <w:rtl w:val="0"/>
+                    </w:rPr>
+                    <w:t xml:space="preserve">At Step 4</w:t>
+                  </w:r>
+                </w:p>
+              </w:tc>
+              <w:tc>
+                <w:tcPr>
+                  <w:tcBorders>
+                    <w:top w:color="000000" w:space="0" w:sz="8" w:val="single"/>
+                    <w:left w:color="000000" w:space="0" w:sz="8" w:val="single"/>
+                    <w:bottom w:color="000000" w:space="0" w:sz="8" w:val="single"/>
+                    <w:right w:color="000000" w:space="0" w:sz="8" w:val="single"/>
+                  </w:tcBorders>
+                  <w:tcMar>
+                    <w:top w:w="100.0" w:type="dxa"/>
+                    <w:left w:w="100.0" w:type="dxa"/>
+                    <w:bottom w:w="100.0" w:type="dxa"/>
+                    <w:right w:w="100.0" w:type="dxa"/>
+                  </w:tcMar>
+                  <w:vAlign w:val="top"/>
+                </w:tcPr>
+                <w:p>
+                  <w:pPr>
+                    <w:rPr>
+                      <w:rFonts w:ascii="Times New Roman" w:cs="Times New Roman" w:eastAsia="Times New Roman" w:hAnsi="Times New Roman"/>
+                      <w:sz w:val="24"/>
+                      <w:szCs w:val="24"/>
+                    </w:rPr>
+                  </w:pPr>
+                  <w:r>
+                    <w:rPr>
+                      <w:rFonts w:ascii="Times New Roman" w:cs="Times New Roman" w:eastAsia="Times New Roman" w:hAnsi="Times New Roman"/>
+                      <w:sz w:val="24"/>
+                      <w:szCs w:val="24"/>
+                      <w:rtl w:val="0"/>
+                    </w:rPr>
+                    <w:t xml:space="preserve">Invalid date format (e.g., publication date)</w:t>
+                  </w:r>
+                </w:p>
+              </w:tc>
+              <w:tc>
+                <w:tcPr>
+                  <w:tcBorders>
+                    <w:top w:color="000000" w:space="0" w:sz="8" w:val="single"/>
+                    <w:left w:color="000000" w:space="0" w:sz="8" w:val="single"/>
+                    <w:bottom w:color="000000" w:space="0" w:sz="8" w:val="single"/>
+                    <w:right w:color="000000" w:space="0" w:sz="8" w:val="single"/>
+                  </w:tcBorders>
+                  <w:tcMar>
+                    <w:top w:w="100.0" w:type="dxa"/>
+                    <w:left w:w="100.0" w:type="dxa"/>
+                    <w:bottom w:w="100.0" w:type="dxa"/>
+                    <w:right w:w="100.0" w:type="dxa"/>
+                  </w:tcMar>
+                  <w:vAlign w:val="top"/>
+                </w:tcPr>
+                <w:p>
+                  <w:pPr>
+                    <w:rPr>
+                      <w:rFonts w:ascii="Times New Roman" w:cs="Times New Roman" w:eastAsia="Times New Roman" w:hAnsi="Times New Roman"/>
+                      <w:sz w:val="24"/>
+                      <w:szCs w:val="24"/>
+                    </w:rPr>
+                  </w:pPr>
+                  <w:r>
+                    <w:rPr>
+                      <w:rFonts w:ascii="Times New Roman" w:cs="Times New Roman" w:eastAsia="Times New Roman" w:hAnsi="Times New Roman"/>
+                      <w:sz w:val="24"/>
+                      <w:szCs w:val="24"/>
+                      <w:rtl w:val="0"/>
+                    </w:rPr>
+                    <w:t xml:space="preserve">Software notifies invalid format</w:t>
+                  </w:r>
+                </w:p>
+              </w:tc>
+              <w:tc>
+                <w:tcPr>
+                  <w:tcBorders>
+                    <w:top w:color="000000" w:space="0" w:sz="8" w:val="single"/>
+                    <w:left w:color="000000" w:space="0" w:sz="8" w:val="single"/>
+                    <w:bottom w:color="000000" w:space="0" w:sz="8" w:val="single"/>
+                    <w:right w:color="000000" w:space="0" w:sz="8" w:val="single"/>
+                  </w:tcBorders>
+                  <w:tcMar>
+                    <w:top w:w="100.0" w:type="dxa"/>
+                    <w:left w:w="100.0" w:type="dxa"/>
+                    <w:bottom w:w="100.0" w:type="dxa"/>
+                    <w:right w:w="100.0" w:type="dxa"/>
+                  </w:tcMar>
+                  <w:vAlign w:val="top"/>
+                </w:tcPr>
+                <w:p>
+                  <w:pPr>
+                    <w:rPr>
+                      <w:rFonts w:ascii="Times New Roman" w:cs="Times New Roman" w:eastAsia="Times New Roman" w:hAnsi="Times New Roman"/>
+                      <w:sz w:val="24"/>
+                      <w:szCs w:val="24"/>
+                    </w:rPr>
+                  </w:pPr>
+                  <w:r>
+                    <w:rPr>
+                      <w:rFonts w:ascii="Times New Roman" w:cs="Times New Roman" w:eastAsia="Times New Roman" w:hAnsi="Times New Roman"/>
+                      <w:sz w:val="24"/>
+                      <w:szCs w:val="24"/>
+                      <w:rtl w:val="0"/>
+                    </w:rPr>
+                    <w:t xml:space="preserve">Step 2</w:t>
+                  </w:r>
+                </w:p>
+              </w:tc>
+            </w:tr>
+            <w:tr>
+              <w:trPr>
+                <w:cantSplit w:val="0"/>
+                <w:trHeight w:val="770" w:hRule="atLeast"/>
+                <w:tblHeader w:val="0"/>
+              </w:trPr>
+              <w:tc>
+                <w:tcPr>
+                  <w:tcBorders>
+                    <w:top w:color="000000" w:space="0" w:sz="8" w:val="single"/>
+                    <w:left w:color="000000" w:space="0" w:sz="8" w:val="single"/>
+                    <w:bottom w:color="000000" w:space="0" w:sz="8" w:val="single"/>
+                    <w:right w:color="000000" w:space="0" w:sz="8" w:val="single"/>
+                  </w:tcBorders>
+                  <w:tcMar>
+                    <w:top w:w="100.0" w:type="dxa"/>
+                    <w:left w:w="100.0" w:type="dxa"/>
+                    <w:bottom w:w="100.0" w:type="dxa"/>
+                    <w:right w:w="100.0" w:type="dxa"/>
+                  </w:tcMar>
+                  <w:vAlign w:val="top"/>
+                </w:tcPr>
+                <w:p>
+                  <w:pPr>
+                    <w:rPr>
+                      <w:rFonts w:ascii="Times New Roman" w:cs="Times New Roman" w:eastAsia="Times New Roman" w:hAnsi="Times New Roman"/>
+                      <w:sz w:val="24"/>
+                      <w:szCs w:val="24"/>
+                    </w:rPr>
+                  </w:pPr>
+                  <w:r>
+                    <w:rPr>
+                      <w:rFonts w:ascii="Times New Roman" w:cs="Times New Roman" w:eastAsia="Times New Roman" w:hAnsi="Times New Roman"/>
+                      <w:sz w:val="24"/>
+                      <w:szCs w:val="24"/>
+                      <w:rtl w:val="0"/>
+                    </w:rPr>
+                    <w:t xml:space="preserve">5</w:t>
+                  </w:r>
+                </w:p>
+              </w:tc>
+              <w:tc>
+                <w:tcPr>
+                  <w:tcBorders>
+                    <w:top w:color="000000" w:space="0" w:sz="8" w:val="single"/>
+                    <w:left w:color="000000" w:space="0" w:sz="8" w:val="single"/>
+                    <w:bottom w:color="000000" w:space="0" w:sz="8" w:val="single"/>
+                    <w:right w:color="000000" w:space="0" w:sz="8" w:val="single"/>
+                  </w:tcBorders>
+                  <w:tcMar>
+                    <w:top w:w="100.0" w:type="dxa"/>
+                    <w:left w:w="100.0" w:type="dxa"/>
+                    <w:bottom w:w="100.0" w:type="dxa"/>
+                    <w:right w:w="100.0" w:type="dxa"/>
+                  </w:tcMar>
+                  <w:vAlign w:val="top"/>
+                </w:tcPr>
+                <w:p>
+                  <w:pPr>
+                    <w:rPr>
+                      <w:rFonts w:ascii="Times New Roman" w:cs="Times New Roman" w:eastAsia="Times New Roman" w:hAnsi="Times New Roman"/>
+                      <w:sz w:val="24"/>
+                      <w:szCs w:val="24"/>
+                    </w:rPr>
+                  </w:pPr>
+                  <w:r>
+                    <w:rPr>
+                      <w:rFonts w:ascii="Times New Roman" w:cs="Times New Roman" w:eastAsia="Times New Roman" w:hAnsi="Times New Roman"/>
+                      <w:sz w:val="24"/>
+                      <w:szCs w:val="24"/>
+                      <w:rtl w:val="0"/>
+                    </w:rPr>
+                    <w:t xml:space="preserve">At Step 5</w:t>
+                  </w:r>
+                </w:p>
+              </w:tc>
+              <w:tc>
+                <w:tcPr>
+                  <w:tcBorders>
+                    <w:top w:color="000000" w:space="0" w:sz="8" w:val="single"/>
+                    <w:left w:color="000000" w:space="0" w:sz="8" w:val="single"/>
+                    <w:bottom w:color="000000" w:space="0" w:sz="8" w:val="single"/>
+                    <w:right w:color="000000" w:space="0" w:sz="8" w:val="single"/>
+                  </w:tcBorders>
+                  <w:tcMar>
+                    <w:top w:w="100.0" w:type="dxa"/>
+                    <w:left w:w="100.0" w:type="dxa"/>
+                    <w:bottom w:w="100.0" w:type="dxa"/>
+                    <w:right w:w="100.0" w:type="dxa"/>
+                  </w:tcMar>
+                  <w:vAlign w:val="top"/>
+                </w:tcPr>
+                <w:p>
+                  <w:pPr>
+                    <w:rPr>
+                      <w:rFonts w:ascii="Times New Roman" w:cs="Times New Roman" w:eastAsia="Times New Roman" w:hAnsi="Times New Roman"/>
+                      <w:sz w:val="24"/>
+                      <w:szCs w:val="24"/>
+                    </w:rPr>
+                  </w:pPr>
+                  <w:r>
+                    <w:rPr>
+                      <w:rFonts w:ascii="Times New Roman" w:cs="Times New Roman" w:eastAsia="Times New Roman" w:hAnsi="Times New Roman"/>
+                      <w:sz w:val="24"/>
+                      <w:szCs w:val="24"/>
+                      <w:rtl w:val="0"/>
+                    </w:rPr>
+                    <w:t xml:space="preserve">User performs Update operation</w:t>
+                  </w:r>
+                </w:p>
+              </w:tc>
+              <w:tc>
+                <w:tcPr>
+                  <w:tcBorders>
+                    <w:top w:color="000000" w:space="0" w:sz="8" w:val="single"/>
+                    <w:left w:color="000000" w:space="0" w:sz="8" w:val="single"/>
+                    <w:bottom w:color="000000" w:space="0" w:sz="8" w:val="single"/>
+                    <w:right w:color="000000" w:space="0" w:sz="8" w:val="single"/>
+                  </w:tcBorders>
+                  <w:tcMar>
+                    <w:top w:w="100.0" w:type="dxa"/>
+                    <w:left w:w="100.0" w:type="dxa"/>
+                    <w:bottom w:w="100.0" w:type="dxa"/>
+                    <w:right w:w="100.0" w:type="dxa"/>
+                  </w:tcMar>
+                  <w:vAlign w:val="top"/>
+                </w:tcPr>
+                <w:p>
+                  <w:pPr>
+                    <w:rPr>
+                      <w:rFonts w:ascii="Times New Roman" w:cs="Times New Roman" w:eastAsia="Times New Roman" w:hAnsi="Times New Roman"/>
+                      <w:sz w:val="24"/>
+                      <w:szCs w:val="24"/>
+                    </w:rPr>
+                  </w:pPr>
+                  <w:r>
+                    <w:rPr>
+                      <w:rFonts w:ascii="Times New Roman" w:cs="Times New Roman" w:eastAsia="Times New Roman" w:hAnsi="Times New Roman"/>
+                      <w:sz w:val="24"/>
+                      <w:szCs w:val="24"/>
+                      <w:rtl w:val="0"/>
+                    </w:rPr>
+                    <w:t xml:space="preserve">Software performs operation Update: applies the submitted changes to the existing record</w:t>
+                  </w:r>
+                </w:p>
+              </w:tc>
+              <w:tc>
+                <w:tcPr>
+                  <w:tcBorders>
+                    <w:top w:color="000000" w:space="0" w:sz="8" w:val="single"/>
+                    <w:left w:color="000000" w:space="0" w:sz="8" w:val="single"/>
+                    <w:bottom w:color="000000" w:space="0" w:sz="8" w:val="single"/>
+                    <w:right w:color="000000" w:space="0" w:sz="8" w:val="single"/>
+                  </w:tcBorders>
+                  <w:tcMar>
+                    <w:top w:w="100.0" w:type="dxa"/>
+                    <w:left w:w="100.0" w:type="dxa"/>
+                    <w:bottom w:w="100.0" w:type="dxa"/>
+                    <w:right w:w="100.0" w:type="dxa"/>
+                  </w:tcMar>
+                  <w:vAlign w:val="top"/>
+                </w:tcPr>
+                <w:p>
+                  <w:pPr>
+                    <w:rPr>
+                      <w:rFonts w:ascii="Times New Roman" w:cs="Times New Roman" w:eastAsia="Times New Roman" w:hAnsi="Times New Roman"/>
+                      <w:sz w:val="24"/>
+                      <w:szCs w:val="24"/>
+                    </w:rPr>
+                  </w:pPr>
+                  <w:r>
+                    <w:rPr>
+                      <w:rFonts w:ascii="Times New Roman" w:cs="Times New Roman" w:eastAsia="Times New Roman" w:hAnsi="Times New Roman"/>
+                      <w:sz w:val="24"/>
+                      <w:szCs w:val="24"/>
+                      <w:rtl w:val="0"/>
+                    </w:rPr>
+                    <w:t xml:space="preserve">Step 6</w:t>
+                  </w:r>
+                </w:p>
+              </w:tc>
+            </w:tr>
+            <w:tr>
+              <w:trPr>
+                <w:cantSplit w:val="0"/>
+                <w:trHeight w:val="770" w:hRule="atLeast"/>
+                <w:tblHeader w:val="0"/>
+              </w:trPr>
+              <w:tc>
+                <w:tcPr>
+                  <w:tcBorders>
+                    <w:top w:color="000000" w:space="0" w:sz="8" w:val="single"/>
+                    <w:left w:color="000000" w:space="0" w:sz="8" w:val="single"/>
+                    <w:bottom w:color="000000" w:space="0" w:sz="8" w:val="single"/>
+                    <w:right w:color="000000" w:space="0" w:sz="8" w:val="single"/>
+                  </w:tcBorders>
+                  <w:tcMar>
+                    <w:top w:w="100.0" w:type="dxa"/>
+                    <w:left w:w="100.0" w:type="dxa"/>
+                    <w:bottom w:w="100.0" w:type="dxa"/>
+                    <w:right w:w="100.0" w:type="dxa"/>
+                  </w:tcMar>
+                  <w:vAlign w:val="top"/>
+                </w:tcPr>
+                <w:p>
+                  <w:pPr>
+                    <w:rPr>
+                      <w:rFonts w:ascii="Times New Roman" w:cs="Times New Roman" w:eastAsia="Times New Roman" w:hAnsi="Times New Roman"/>
+                      <w:sz w:val="24"/>
+                      <w:szCs w:val="24"/>
+                    </w:rPr>
+                  </w:pPr>
+                  <w:r>
+                    <w:rPr>
+                      <w:rFonts w:ascii="Times New Roman" w:cs="Times New Roman" w:eastAsia="Times New Roman" w:hAnsi="Times New Roman"/>
+                      <w:sz w:val="24"/>
+                      <w:szCs w:val="24"/>
+                      <w:rtl w:val="0"/>
+                    </w:rPr>
+                    <w:t xml:space="preserve">6</w:t>
+                  </w:r>
+                </w:p>
+              </w:tc>
+              <w:tc>
+                <w:tcPr>
+                  <w:tcBorders>
+                    <w:top w:color="000000" w:space="0" w:sz="8" w:val="single"/>
+                    <w:left w:color="000000" w:space="0" w:sz="8" w:val="single"/>
+                    <w:bottom w:color="000000" w:space="0" w:sz="8" w:val="single"/>
+                    <w:right w:color="000000" w:space="0" w:sz="8" w:val="single"/>
+                  </w:tcBorders>
+                  <w:tcMar>
+                    <w:top w:w="100.0" w:type="dxa"/>
+                    <w:left w:w="100.0" w:type="dxa"/>
+                    <w:bottom w:w="100.0" w:type="dxa"/>
+                    <w:right w:w="100.0" w:type="dxa"/>
+                  </w:tcMar>
+                  <w:vAlign w:val="top"/>
+                </w:tcPr>
+                <w:p>
+                  <w:pPr>
+                    <w:rPr>
+                      <w:rFonts w:ascii="Times New Roman" w:cs="Times New Roman" w:eastAsia="Times New Roman" w:hAnsi="Times New Roman"/>
+                      <w:sz w:val="24"/>
+                      <w:szCs w:val="24"/>
+                    </w:rPr>
+                  </w:pPr>
+                  <w:r>
+                    <w:rPr>
+                      <w:rFonts w:ascii="Times New Roman" w:cs="Times New Roman" w:eastAsia="Times New Roman" w:hAnsi="Times New Roman"/>
+                      <w:sz w:val="24"/>
+                      <w:szCs w:val="24"/>
                       <w:rtl w:val="0"/>
                     </w:rPr>
                     <w:t xml:space="preserve">At Step 3 (Update)</w:t>
@@ -1309,10 +1829,17 @@
                 </w:tcPr>
                 <w:p>
                   <w:pPr>
-                    <w:rPr/>
-                  </w:pPr>
-                  <w:r>
-                    <w:rPr>
+                    <w:rPr>
+                      <w:rFonts w:ascii="Times New Roman" w:cs="Times New Roman" w:eastAsia="Times New Roman" w:hAnsi="Times New Roman"/>
+                      <w:sz w:val="24"/>
+                      <w:szCs w:val="24"/>
+                    </w:rPr>
+                  </w:pPr>
+                  <w:r>
+                    <w:rPr>
+                      <w:rFonts w:ascii="Times New Roman" w:cs="Times New Roman" w:eastAsia="Times New Roman" w:hAnsi="Times New Roman"/>
+                      <w:sz w:val="24"/>
+                      <w:szCs w:val="24"/>
                       <w:rtl w:val="0"/>
                     </w:rPr>
                     <w:t xml:space="preserve">Product Manager adjusts stock quantity manually</w:t>
@@ -1337,10 +1864,17 @@
                 </w:tcPr>
                 <w:p>
                   <w:pPr>
-                    <w:rPr/>
-                  </w:pPr>
-                  <w:r>
-                    <w:rPr>
+                    <w:rPr>
+                      <w:rFonts w:ascii="Times New Roman" w:cs="Times New Roman" w:eastAsia="Times New Roman" w:hAnsi="Times New Roman"/>
+                      <w:sz w:val="24"/>
+                      <w:szCs w:val="24"/>
+                    </w:rPr>
+                  </w:pPr>
+                  <w:r>
+                    <w:rPr>
+                      <w:rFonts w:ascii="Times New Roman" w:cs="Times New Roman" w:eastAsia="Times New Roman" w:hAnsi="Times New Roman"/>
+                      <w:sz w:val="24"/>
+                      <w:szCs w:val="24"/>
                       <w:rtl w:val="0"/>
                     </w:rPr>
                     <w:t xml:space="preserve">Software requires reason for stock change and records it</w:t>
@@ -1365,10 +1899,17 @@
                 </w:tcPr>
                 <w:p>
                   <w:pPr>
-                    <w:rPr/>
-                  </w:pPr>
-                  <w:r>
-                    <w:rPr>
+                    <w:rPr>
+                      <w:rFonts w:ascii="Times New Roman" w:cs="Times New Roman" w:eastAsia="Times New Roman" w:hAnsi="Times New Roman"/>
+                      <w:sz w:val="24"/>
+                      <w:szCs w:val="24"/>
+                    </w:rPr>
+                  </w:pPr>
+                  <w:r>
+                    <w:rPr>
+                      <w:rFonts w:ascii="Times New Roman" w:cs="Times New Roman" w:eastAsia="Times New Roman" w:hAnsi="Times New Roman"/>
+                      <w:sz w:val="24"/>
+                      <w:szCs w:val="24"/>
                       <w:rtl w:val="0"/>
                     </w:rPr>
                     <w:t xml:space="preserve">Step 4</w:t>
@@ -1792,13 +2333,14 @@
                 </w:tcPr>
                 <w:p>
                   <w:pPr>
-                    <w:rPr/>
-                  </w:pPr>
-                  <w:r>
-                    <w:rPr>
-                      <w:rtl w:val="0"/>
-                    </w:rPr>
-                    <w:t xml:space="preserve">Title exists</w:t>
+                    <w:ind w:left="0" w:firstLine="0"/>
+                    <w:rPr/>
+                  </w:pPr>
+                  <w:r>
+                    <w:rPr>
+                      <w:rtl w:val="0"/>
+                    </w:rPr>
+                    <w:t xml:space="preserve">Must be between 3 and 100 characters long; no special characters other than hyphen and apostrophe.</w:t>
                   </w:r>
                 </w:p>
               </w:tc>
@@ -2099,7 +2641,7 @@
                     <w:rPr>
                       <w:rtl w:val="0"/>
                     </w:rPr>
-                    <w:t xml:space="preserve">&gt; 0; used for price-band validation (see A.6)</w:t>
+                    <w:t xml:space="preserve">&gt; 0; used for price-band validation (see A.6); </w:t>
                   </w:r>
                 </w:p>
               </w:tc>
@@ -2859,7 +3401,7 @@
                     <w:rPr>
                       <w:rtl w:val="0"/>
                     </w:rPr>
-                    <w:t xml:space="preserve">Non-empty</w:t>
+                    <w:t xml:space="preserve">Must be between 1 and 50 characters; can contain letters, spaces, and commas.</w:t>
                   </w:r>
                 </w:p>
               </w:tc>
@@ -3221,7 +3763,7 @@
                     <w:rPr>
                       <w:rtl w:val="0"/>
                     </w:rPr>
-                    <w:t xml:space="preserve">Non-empty</w:t>
+                    <w:t xml:space="preserve">Must be between 3 and 100 characters; only alphabetic characters, spaces, and hyphens.</w:t>
                   </w:r>
                 </w:p>
               </w:tc>
@@ -3402,7 +3944,7 @@
                     <w:rPr>
                       <w:rtl w:val="0"/>
                     </w:rPr>
-                    <w:t xml:space="preserve">Valid date format (the system notifies if date format is incorrect)</w:t>
+                    <w:t xml:space="preserve">Must follow the format dd/mm/yyyy; the date must be a valid date (e.g., 30/12/2018).</w:t>
                   </w:r>
                 </w:p>
               </w:tc>
@@ -3855,7 +4397,7 @@
                     <w:rPr>
                       <w:rtl w:val="0"/>
                     </w:rPr>
-                    <w:t xml:space="preserve">Non-empty</w:t>
+                    <w:t xml:space="preserve">Must be between 3 and 100 characters long; only alphabetic characters, spaces, and hyphens.</w:t>
                   </w:r>
                 </w:p>
               </w:tc>
@@ -4036,7 +4578,7 @@
                     <w:rPr>
                       <w:rtl w:val="0"/>
                     </w:rPr>
-                    <w:t xml:space="preserve">Non-empty</w:t>
+                    <w:t xml:space="preserve">Must be between 3 and 100 characters; only alphabetic characters, spaces, and hyphens.</w:t>
                   </w:r>
                 </w:p>
               </w:tc>
@@ -4217,7 +4759,7 @@
                     <w:rPr>
                       <w:rtl w:val="0"/>
                     </w:rPr>
-                    <w:t xml:space="preserve">Valid date format (the system notifies if date format is incorrect)</w:t>
+                    <w:t xml:space="preserve">Must follow the format dd/mm/yyyy; the date must be a valid date (e.g., 05/10/2025).</w:t>
                   </w:r>
                 </w:p>
               </w:tc>
@@ -4398,7 +4940,7 @@
                     <w:rPr>
                       <w:rtl w:val="0"/>
                     </w:rPr>
-                    <w:t xml:space="preserve">—</w:t>
+                    <w:t xml:space="preserve">Must be a positive integer (e.g., 342).</w:t>
                   </w:r>
                 </w:p>
               </w:tc>
@@ -4579,7 +5121,7 @@
                     <w:rPr>
                       <w:rtl w:val="0"/>
                     </w:rPr>
-                    <w:t xml:space="preserve">—</w:t>
+                    <w:t xml:space="preserve">Must be one of {Daily, Weekly, Monthly}.</w:t>
                   </w:r>
                 </w:p>
               </w:tc>
@@ -4760,7 +5302,7 @@
                     <w:rPr>
                       <w:rtl w:val="0"/>
                     </w:rPr>
-                    <w:t xml:space="preserve">—</w:t>
+                    <w:t xml:space="preserve">Must be 8 digits, with a hyphen between each 4 digits.</w:t>
                   </w:r>
                 </w:p>
               </w:tc>
@@ -4941,7 +5483,7 @@
                     <w:rPr>
                       <w:rtl w:val="0"/>
                     </w:rPr>
-                    <w:t xml:space="preserve">—</w:t>
+                    <w:t xml:space="preserve">Must be a valid language.</w:t>
                   </w:r>
                 </w:p>
               </w:tc>
@@ -5122,7 +5664,7 @@
                     <w:rPr>
                       <w:rtl w:val="0"/>
                     </w:rPr>
-                    <w:t xml:space="preserve">—</w:t>
+                    <w:t xml:space="preserve">Must be a valid section from section rules.</w:t>
                   </w:r>
                 </w:p>
               </w:tc>
@@ -5586,7 +6128,7 @@
                     <w:rPr>
                       <w:rtl w:val="0"/>
                     </w:rPr>
-                    <w:t xml:space="preserve">Non-empty</w:t>
+                    <w:t xml:space="preserve">Must be between 3 and 100 characters long; only alphabetic characters, spaces, and hyphens.</w:t>
                   </w:r>
                 </w:p>
               </w:tc>
@@ -5767,7 +6309,7 @@
                     <w:rPr>
                       <w:rtl w:val="0"/>
                     </w:rPr>
-                    <w:t xml:space="preserve">Non-empty</w:t>
+                    <w:t xml:space="preserve">Must be between 3 and 100 characters long; only alphabetic characters, spaces, and hyphens.</w:t>
                   </w:r>
                 </w:p>
               </w:tc>
@@ -6129,7 +6671,7 @@
                     <w:rPr>
                       <w:rtl w:val="0"/>
                     </w:rPr>
-                    <w:t xml:space="preserve">Non-empty</w:t>
+                    <w:t xml:space="preserve">Must be a valid musical genre from musical genre rules.</w:t>
                   </w:r>
                 </w:p>
               </w:tc>
@@ -6310,7 +6852,7 @@
                     <w:rPr>
                       <w:rtl w:val="0"/>
                     </w:rPr>
-                    <w:t xml:space="preserve">—</w:t>
+                    <w:t xml:space="preserve">Must follow the format dd/mm/yyyy; the date must be a valid date (e.g., 05/10/2025).</w:t>
                   </w:r>
                 </w:p>
               </w:tc>
@@ -6944,7 +7486,7 @@
                     <w:rPr>
                       <w:rtl w:val="0"/>
                     </w:rPr>
-                    <w:t xml:space="preserve">Non-empty</w:t>
+                    <w:t xml:space="preserve">Must be between 3 and 100 characters long; only alphabetic characters, spaces, and hyphens.</w:t>
                   </w:r>
                 </w:p>
               </w:tc>
@@ -7306,7 +7848,7 @@
                     <w:rPr>
                       <w:rtl w:val="0"/>
                     </w:rPr>
-                    <w:t xml:space="preserve">Non-empty</w:t>
+                    <w:t xml:space="preserve">Must be between 3 and 100 characters long; only alphabetic characters, spaces, and hyphens.</w:t>
                   </w:r>
                 </w:p>
               </w:tc>
@@ -7487,7 +8029,7 @@
                     <w:rPr>
                       <w:rtl w:val="0"/>
                     </w:rPr>
-                    <w:t xml:space="preserve">Non-empty</w:t>
+                    <w:t xml:space="preserve">Must be a valid language.</w:t>
                   </w:r>
                 </w:p>
               </w:tc>
@@ -7668,7 +8210,7 @@
                     <w:rPr>
                       <w:rtl w:val="0"/>
                     </w:rPr>
-                    <w:t xml:space="preserve">Non-empty</w:t>
+                    <w:t xml:space="preserve">Must be valid languages.</w:t>
                   </w:r>
                 </w:p>
               </w:tc>
@@ -7849,7 +8391,7 @@
                     <w:rPr>
                       <w:rtl w:val="0"/>
                     </w:rPr>
-                    <w:t xml:space="preserve">—</w:t>
+                    <w:t xml:space="preserve">Must follow the format dd/mm/yyyy; the date must be a valid date (e.g., 05/10/2025).</w:t>
                   </w:r>
                 </w:p>
               </w:tc>
@@ -8030,7 +8572,7 @@
                     <w:rPr>
                       <w:rtl w:val="0"/>
                     </w:rPr>
-                    <w:t xml:space="preserve">—</w:t>
+                    <w:t xml:space="preserve">Must be a valid genre from film genre rules.</w:t>
                   </w:r>
                 </w:p>
               </w:tc>

</xml_diff>